<commit_message>
Update letter body text with corrections from user
Co-Authored-By: Claude Sonnet 4.6 <noreply@anthropic.com>
Claude-Session: https://claude.ai/code/session_01PWM2jbYYXzZe65VxyFNAUN
</commit_message>
<xml_diff>
--- a/出品依頼状_泉屋博古館東京.docx
+++ b/出品依頼状_泉屋博古館東京.docx
@@ -78,13 +78,13 @@
     <!-- 本文1 -->
     <w:p>
       <w:r>
-        <w:t xml:space="preserve">　このたび、当館では下記の通り特別展を開催する運びとなりました。</w:t>
+        <w:t xml:space="preserve">　このたび、当館では別紙の通り特別展を開催する運びとなりました。</w:t>
       </w:r>
     </w:p>
     <!-- 本文2 -->
     <w:p>
       <w:r>
-        <w:t xml:space="preserve">　本展は、大同生命保険株式会社により新たに見出された加島屋旧蔵《青磁刻花五爪龍文盤》が当館に寄贈されたことを記念し、江戸時代の幕府金融を担い、数多くの東洋の名品を蒐集した大坂の豪商・加島屋（廣岡家）ゆかりの名宝を一堂に集めるものです。離散した作品が現在の所蔵先へ至るまでのそれぞれの来歴を「五つの物語」として紹介し、その魅力と歴史的意義をひもとく展覧会です。</w:t>
+        <w:t xml:space="preserve">　本展は、大同生命保険株式会社により新たに見出された加島屋旧蔵《青磁刻花五爪龍文盤》が当館に寄贈されることを記念し、江戸時代の幕府金融を担い、数多くの東洋の名品を蒐集した大坂の豪商・加島屋（廣岡家）ゆかりの名宝を一堂に集めるものです。各作品が加島屋へ伝わるまでの経緯、そして加島屋を離れ現在の所蔵先へ至るまでのそれぞれの来歴を「五つの物語」として紹介し、その魅力と歴史的意義をひもとく展覧会です。</w:t>
       </w:r>
     </w:p>
     <!-- 本文3・依頼文 -->

</xml_diff>

<commit_message>
Replace 五つの物語 with ○つの物語 pending final work count
Co-Authored-By: Claude Sonnet 4.6 <noreply@anthropic.com>
Claude-Session: https://claude.ai/code/session_01PWM2jbYYXzZe65VxyFNAUN
</commit_message>
<xml_diff>
--- a/出品依頼状_泉屋博古館東京.docx
+++ b/出品依頼状_泉屋博古館東京.docx
@@ -84,7 +84,7 @@
     <!-- 本文2 -->
     <w:p>
       <w:r>
-        <w:t xml:space="preserve">　本展は、大同生命保険株式会社により新たに見出された加島屋旧蔵《青磁刻花五爪龍文盤》が当館に寄贈されることを記念し、江戸時代の幕府金融を担い、数多くの東洋の名品を蒐集した大坂の豪商・加島屋（廣岡家）ゆかりの名宝を一堂に集めるものです。各作品が加島屋へ伝わるまでの経緯、そして加島屋を離れ現在の所蔵先へ至るまでのそれぞれの来歴を「五つの物語」として紹介し、その魅力と歴史的意義をひもとく展覧会です。</w:t>
+        <w:t xml:space="preserve">　本展は、大同生命保険株式会社により新たに見出された加島屋旧蔵《青磁刻花五爪龍文盤》が当館に寄贈されることを記念し、江戸時代の幕府金融を担い、数多くの東洋の名品を蒐集した大坂の豪商・加島屋（廣岡家）ゆかりの名宝を一堂に集めるものです。各作品が加島屋へ伝わるまでの経緯、そして加島屋を離れ現在の所蔵先へ至るまでのそれぞれの来歴を「○つの物語」として紹介し、その魅力と歴史的意義をひもとく展覧会です。</w:t>
       </w:r>
     </w:p>
     <!-- 本文3・依頼文 -->
@@ -134,7 +134,7 @@
     </w:p>
     <w:p>
       <w:r>
-        <w:t xml:space="preserve">　展覧会名称：受贈記念特別展「大坂の豪商・加島屋旧蔵の名宝―五つの物語―」（仮称）</w:t>
+        <w:t xml:space="preserve">　展覧会名称：受贈記念特別展「大坂の豪商・加島屋旧蔵の名宝―○つの物語―」（仮称）</w:t>
       </w:r>
     </w:p>
     <w:p>

</xml_diff>

<commit_message>
Rebuild 出品依頼状 using new logo template from user
Co-Authored-By: Claude Sonnet 4.6 <noreply@anthropic.com>
Claude-Session: https://claude.ai/code/session_01PWM2jbYYXzZe65VxyFNAUN
</commit_message>
<xml_diff>
--- a/出品依頼状_泉屋博古館東京.docx
+++ b/出品依頼状_泉屋博古館東京.docx
@@ -1,39 +1,96 @@
 
 <file path=word/document.xml><?xml version="1.0" encoding="utf-8"?>
-<w:document xmlns:wpc="http://schemas.microsoft.com/office/word/2010/wordprocessingCanvas" xmlns:mc="http://schemas.openxmlformats.org/markup-compatibility/2006" xmlns:r="http://schemas.openxmlformats.org/officeDocument/2006/relationships" xmlns:m="http://schemas.openxmlformats.org/officeDocument/2006/math" xmlns:wp="http://schemas.openxmlformats.org/drawingml/2006/wordprocessingDrawing" xmlns:w="http://schemas.openxmlformats.org/wordprocessingml/2006/main" xmlns:w14="http://schemas.microsoft.com/office/word/2010/wordml" xmlns:w15="http://schemas.microsoft.com/office/word/2012/wordml" mc:Ignorable="w14 w15">
+<w:document xmlns:wpc="http://schemas.microsoft.com/office/word/2010/wordprocessingCanvas" xmlns:cx="http://schemas.microsoft.com/office/drawing/2014/chartex" xmlns:cx1="http://schemas.microsoft.com/office/drawing/2015/9/8/chartex" xmlns:cx2="http://schemas.microsoft.com/office/drawing/2015/10/21/chartex" xmlns:cx3="http://schemas.microsoft.com/office/drawing/2016/5/9/chartex" xmlns:cx4="http://schemas.microsoft.com/office/drawing/2016/5/10/chartex" xmlns:cx5="http://schemas.microsoft.com/office/drawing/2016/5/11/chartex" xmlns:cx6="http://schemas.microsoft.com/office/drawing/2016/5/12/chartex" xmlns:cx7="http://schemas.microsoft.com/office/drawing/2016/5/13/chartex" xmlns:cx8="http://schemas.microsoft.com/office/drawing/2016/5/14/chartex" xmlns:mc="http://schemas.openxmlformats.org/markup-compatibility/2006" xmlns:aink="http://schemas.microsoft.com/office/drawing/2016/ink" xmlns:am3d="http://schemas.microsoft.com/office/drawing/2017/model3d" xmlns:o="urn:schemas-microsoft-com:office:office" xmlns:oel="http://schemas.microsoft.com/office/2019/extlst" xmlns:r="http://schemas.openxmlformats.org/officeDocument/2006/relationships" xmlns:m="http://schemas.openxmlformats.org/officeDocument/2006/math" xmlns:v="urn:schemas-microsoft-com:vml" xmlns:wp14="http://schemas.microsoft.com/office/word/2010/wordprocessingDrawing" xmlns:wp="http://schemas.openxmlformats.org/drawingml/2006/wordprocessingDrawing" xmlns:w10="urn:schemas-microsoft-com:office:word" xmlns:w="http://schemas.openxmlformats.org/wordprocessingml/2006/main" xmlns:w14="http://schemas.microsoft.com/office/word/2010/wordml" xmlns:w15="http://schemas.microsoft.com/office/word/2012/wordml" xmlns:w16cex="http://schemas.microsoft.com/office/word/2018/wordml/cex" xmlns:w16cid="http://schemas.microsoft.com/office/word/2016/wordml/cid" xmlns:w16="http://schemas.microsoft.com/office/word/2018/wordml" xmlns:w16du="http://schemas.microsoft.com/office/word/2023/wordml/word16du" xmlns:w16sdtdh="http://schemas.microsoft.com/office/word/2020/wordml/sdtdatahash" xmlns:w16sdtfl="http://schemas.microsoft.com/office/word/2024/wordml/sdtformatlock" xmlns:w16se="http://schemas.microsoft.com/office/word/2015/wordml/symex" xmlns:wpg="http://schemas.microsoft.com/office/word/2010/wordprocessingGroup" xmlns:wpi="http://schemas.microsoft.com/office/word/2010/wordprocessingInk" xmlns:wne="http://schemas.microsoft.com/office/word/2006/wordml" xmlns:wps="http://schemas.microsoft.com/office/word/2010/wordprocessingShape" mc:Ignorable="w14 w15 w16se w16cid w16 w16cex w16sdtdh w16sdtfl w16du wp14">
   <w:body>
-    <!-- 日付（右寄せ） -->
     <w:p>
       <w:pPr>
         <w:jc w:val="right"/>
       </w:pPr>
-      <w:r>
-        <w:t>令和８年６月２０日</w:t>
-      </w:r>
-    </w:p>
-    <!-- 宛先 -->
-    <w:p>
-      <w:r>
+    </w:p>
+    <w:p>
+      <w:pPr>
+        <w:jc w:val="right"/>
+        <w:rPr>
+          <w:lang w:eastAsia="zh-TW"/>
+        </w:rPr>
+      </w:pPr>
+      <w:r>
+        <w:rPr>
+          <w:lang w:eastAsia="zh-TW"/>
+        </w:rPr>
+        <w:t>令和８年</w:t>
+      </w:r>
+      <w:r>
+        <w:rPr>
+          <w:rFonts w:hint="eastAsia"/>
+          <w:lang w:eastAsia="zh-TW"/>
+        </w:rPr>
+        <w:t>７</w:t>
+      </w:r>
+      <w:r>
+        <w:rPr>
+          <w:lang w:eastAsia="zh-TW"/>
+        </w:rPr>
+        <w:t>月</w:t>
+      </w:r>
+      <w:r>
+        <w:rPr>
+          <w:rFonts w:hint="eastAsia"/>
+          <w:lang w:eastAsia="zh-TW"/>
+        </w:rPr>
+        <w:t xml:space="preserve">　</w:t>
+      </w:r>
+      <w:r>
+        <w:rPr>
+          <w:lang w:eastAsia="zh-TW"/>
+        </w:rPr>
+        <w:t>日</w:t>
+      </w:r>
+    </w:p>
+    <w:p>
+      <w:pPr>
+        <w:rPr>
+          <w:lang w:eastAsia="zh-TW"/>
+        </w:rPr>
+      </w:pPr>
+      <w:r>
+        <w:rPr>
+          <w:lang w:eastAsia="zh-TW"/>
+        </w:rPr>
         <w:t>泉屋博古館東京</w:t>
       </w:r>
     </w:p>
     <w:p>
-      <w:r>
-        <w:t xml:space="preserve">館長　野地　耕一郎　様</w:t>
-      </w:r>
-    </w:p>
-    <!-- 空行 -->
-    <w:p>
-      <w:r>
-        <w:t/>
-      </w:r>
-    </w:p>
-    <!-- 差出人（右寄せ） -->
+      <w:pPr>
+        <w:rPr>
+          <w:lang w:eastAsia="zh-TW"/>
+        </w:rPr>
+      </w:pPr>
+      <w:r>
+        <w:rPr>
+          <w:lang w:eastAsia="zh-TW"/>
+        </w:rPr>
+        <w:t>館長　野地　耕一郎　様</w:t>
+      </w:r>
+    </w:p>
+    <w:p>
+      <w:pPr>
+        <w:rPr>
+          <w:lang w:eastAsia="zh-TW"/>
+        </w:rPr>
+      </w:pPr>
+    </w:p>
     <w:p>
       <w:pPr>
         <w:jc w:val="right"/>
-      </w:pPr>
-      <w:r>
+        <w:rPr>
+          <w:lang w:eastAsia="zh-TW"/>
+        </w:rPr>
+      </w:pPr>
+      <w:r>
+        <w:rPr>
+          <w:lang w:eastAsia="zh-TW"/>
+        </w:rPr>
         <w:t>大阪市立東洋陶磁美術館</w:t>
       </w:r>
     </w:p>
@@ -45,13 +102,7 @@
         <w:t>館長　今井　敦</w:t>
       </w:r>
     </w:p>
-    <!-- 空行 -->
-    <w:p>
-      <w:r>
-        <w:t/>
-      </w:r>
-    </w:p>
-    <!-- 件名（中央） -->
+    <w:p/>
     <w:p>
       <w:pPr>
         <w:jc w:val="center"/>
@@ -60,40 +111,72 @@
         <w:rPr>
           <w:b/>
         </w:rPr>
-        <w:t>特別展「大坂の豪商・加島屋旧蔵の名宝―五つの物語―」（仮称）ご出品のお願い</w:t>
-      </w:r>
-    </w:p>
-    <!-- 空行 -->
-    <w:p>
-      <w:r>
-        <w:t/>
-      </w:r>
-    </w:p>
-    <!-- 頭語 -->
+        <w:t>特別展「大坂の豪商・加島屋旧蔵の名宝</w:t>
+      </w:r>
+      <w:r>
+        <w:rPr>
+          <w:b/>
+        </w:rPr>
+        <w:t>―</w:t>
+      </w:r>
+      <w:r>
+        <w:rPr>
+          <w:b/>
+        </w:rPr>
+        <w:t>○つの物語</w:t>
+      </w:r>
+      <w:r>
+        <w:rPr>
+          <w:b/>
+        </w:rPr>
+        <w:t>―</w:t>
+      </w:r>
+      <w:r>
+        <w:rPr>
+          <w:b/>
+        </w:rPr>
+        <w:t>」（仮称）ご出品のお願い</w:t>
+      </w:r>
+    </w:p>
+    <w:p/>
     <w:p>
       <w:r>
         <w:t>謹啓　時下ますますご清栄のこととお慶び申し上げます。平素より格別のご高配を賜り、厚く御礼申し上げます。</w:t>
       </w:r>
     </w:p>
-    <!-- 本文1 -->
-    <w:p>
-      <w:r>
-        <w:t xml:space="preserve">　このたび、当館では別紙の通り特別展を開催する運びとなりました。</w:t>
-      </w:r>
-    </w:p>
-    <!-- 本文2 -->
-    <w:p>
-      <w:r>
-        <w:t xml:space="preserve">　本展は、大同生命保険株式会社により新たに見出された加島屋旧蔵《青磁刻花五爪龍文盤》が当館に寄贈されることを記念し、江戸時代の幕府金融を担い、数多くの東洋の名品を蒐集した大坂の豪商・加島屋（廣岡家）ゆかりの名宝を一堂に集めるものです。各作品が加島屋へ伝わるまでの経緯、そして加島屋を離れ現在の所蔵先へ至るまでのそれぞれの来歴を「○つの物語」として紹介し、その魅力と歴史的意義をひもとく展覧会です。</w:t>
-      </w:r>
-    </w:p>
-    <!-- 本文3・依頼文 -->
+    <w:p>
+      <w:r>
+        <w:t xml:space="preserve">　このたび、当館では</w:t>
+      </w:r>
+      <w:r>
+        <w:rPr>
+          <w:rFonts w:hint="eastAsia"/>
+        </w:rPr>
+        <w:t>別紙の</w:t>
+      </w:r>
+      <w:r>
+        <w:t>通り特別展を開催する運びとなりました。</w:t>
+      </w:r>
+    </w:p>
+    <w:p>
+      <w:r>
+        <w:t xml:space="preserve">　本展は、大同生命保険株式会社により新たに見出された加島屋旧蔵《青磁刻花五爪龍文盤》が当館に寄贈され</w:t>
+      </w:r>
+      <w:r>
+        <w:rPr>
+          <w:rFonts w:hint="eastAsia"/>
+        </w:rPr>
+        <w:t>る</w:t>
+      </w:r>
+      <w:r>
+        <w:t>ことを記念し、江戸時代の幕府金融を担い、数多くの東洋の名品を蒐集した大坂の豪商・加島屋（廣岡家）ゆかりの名宝を一堂に集めるものです。各作品が加島屋へ伝わるまでの経緯、そして加島屋を離れ現在の所蔵先へ至るまでのそれぞれの来歴を「○つの物語」として紹介し、その魅力と歴史的意義をひもとく展覧会です。</w:t>
+      </w:r>
+    </w:p>
     <w:p>
       <w:r>
         <w:t xml:space="preserve">　つきましては、本展の趣旨をお汲み取りいただき、貴館ご所蔵の下記作品をご出品賜りますよう、何卒よろしくお願い申し上げます。</w:t>
       </w:r>
     </w:p>
-    <!-- 結語 -->
     <w:p>
       <w:pPr>
         <w:jc w:val="right"/>
@@ -102,13 +185,7 @@
         <w:t>謹白</w:t>
       </w:r>
     </w:p>
-    <!-- 空行 -->
-    <w:p>
-      <w:r>
-        <w:t/>
-      </w:r>
-    </w:p>
-    <!-- 記 -->
+    <w:p/>
     <w:p>
       <w:pPr>
         <w:jc w:val="center"/>
@@ -117,13 +194,7 @@
         <w:t>記</w:t>
       </w:r>
     </w:p>
-    <!-- 空行 -->
-    <w:p>
-      <w:r>
-        <w:t/>
-      </w:r>
-    </w:p>
-    <!-- 1. 展覧会概要 -->
+    <w:p/>
     <w:p>
       <w:r>
         <w:rPr>
@@ -134,46 +205,267 @@
     </w:p>
     <w:p>
       <w:r>
-        <w:t xml:space="preserve">　展覧会名称：受贈記念特別展「大坂の豪商・加島屋旧蔵の名宝―○つの物語―」（仮称）</w:t>
-      </w:r>
-    </w:p>
-    <w:p>
-      <w:r>
-        <w:t xml:space="preserve">　会　　　期：2027年４月17日（土）〜９月26日（日）</w:t>
-      </w:r>
-    </w:p>
-    <w:p>
-      <w:r>
-        <w:t xml:space="preserve">　会　　　場：大阪市立東洋陶磁美術館（〒530-0005　大阪市北区中之島1-1-26）</w:t>
-      </w:r>
-    </w:p>
-    <w:p>
-      <w:r>
-        <w:t xml:space="preserve">　開 館 時 間：午前9時30分〜午後5時（入館は午後4時30分まで）</w:t>
-      </w:r>
-    </w:p>
-    <w:p>
-      <w:r>
-        <w:t xml:space="preserve">　主　　　催：大阪市立東洋陶磁美術館</w:t>
-      </w:r>
-    </w:p>
-    <w:p>
-      <w:r>
-        <w:t xml:space="preserve">　共　　　催：NHKエンタープライズ近畿</w:t>
-      </w:r>
-    </w:p>
-    <w:p>
-      <w:r>
-        <w:t xml:space="preserve">　特 別 協 賛：大同生命保険株式会社</w:t>
-      </w:r>
-    </w:p>
-    <!-- 空行 -->
-    <w:p>
-      <w:r>
-        <w:t/>
-      </w:r>
-    </w:p>
-    <!-- 2. 拝借希望作品 -->
+        <w:t xml:space="preserve">　展覧会名称：受贈記念特別展「大坂の豪商・加島屋旧蔵の名宝</w:t>
+      </w:r>
+      <w:r>
+        <w:t>―</w:t>
+      </w:r>
+      <w:r>
+        <w:t>○つの物語</w:t>
+      </w:r>
+      <w:r>
+        <w:t>―</w:t>
+      </w:r>
+      <w:r>
+        <w:t>」（仮称）</w:t>
+      </w:r>
+    </w:p>
+    <w:p>
+      <w:pPr>
+        <w:rPr>
+          <w:lang w:eastAsia="zh-CN"/>
+        </w:rPr>
+      </w:pPr>
+      <w:r>
+        <w:t xml:space="preserve">　</w:t>
+      </w:r>
+      <w:r>
+        <w:rPr>
+          <w:lang w:eastAsia="zh-CN"/>
+        </w:rPr>
+        <w:t>会　　　期：</w:t>
+      </w:r>
+      <w:r>
+        <w:rPr>
+          <w:lang w:eastAsia="zh-CN"/>
+        </w:rPr>
+        <w:t>2027</w:t>
+      </w:r>
+      <w:r>
+        <w:rPr>
+          <w:lang w:eastAsia="zh-CN"/>
+        </w:rPr>
+        <w:t>年４月</w:t>
+      </w:r>
+      <w:r>
+        <w:rPr>
+          <w:lang w:eastAsia="zh-CN"/>
+        </w:rPr>
+        <w:t>17</w:t>
+      </w:r>
+      <w:r>
+        <w:rPr>
+          <w:lang w:eastAsia="zh-CN"/>
+        </w:rPr>
+        <w:t>日（土）〜９月</w:t>
+      </w:r>
+      <w:r>
+        <w:rPr>
+          <w:lang w:eastAsia="zh-CN"/>
+        </w:rPr>
+        <w:t>26</w:t>
+      </w:r>
+      <w:r>
+        <w:rPr>
+          <w:lang w:eastAsia="zh-CN"/>
+        </w:rPr>
+        <w:t>日（日）</w:t>
+      </w:r>
+    </w:p>
+    <w:p>
+      <w:pPr>
+        <w:rPr>
+          <w:lang w:eastAsia="zh-TW"/>
+        </w:rPr>
+      </w:pPr>
+      <w:r>
+        <w:rPr>
+          <w:lang w:eastAsia="zh-CN"/>
+        </w:rPr>
+        <w:t xml:space="preserve">　</w:t>
+      </w:r>
+      <w:r>
+        <w:rPr>
+          <w:lang w:eastAsia="zh-TW"/>
+        </w:rPr>
+        <w:t>会　　　場：大阪市立東洋陶磁美術館（〒</w:t>
+      </w:r>
+      <w:r>
+        <w:rPr>
+          <w:lang w:eastAsia="zh-TW"/>
+        </w:rPr>
+        <w:t>530-0005</w:t>
+      </w:r>
+      <w:r>
+        <w:rPr>
+          <w:lang w:eastAsia="zh-TW"/>
+        </w:rPr>
+        <w:t xml:space="preserve">　大阪市北区中之島</w:t>
+      </w:r>
+      <w:r>
+        <w:rPr>
+          <w:lang w:eastAsia="zh-TW"/>
+        </w:rPr>
+        <w:t>1-1-26</w:t>
+      </w:r>
+      <w:r>
+        <w:rPr>
+          <w:lang w:eastAsia="zh-TW"/>
+        </w:rPr>
+        <w:t>）</w:t>
+      </w:r>
+    </w:p>
+    <w:p>
+      <w:r>
+        <w:rPr>
+          <w:lang w:eastAsia="zh-TW"/>
+        </w:rPr>
+        <w:t xml:space="preserve">　</w:t>
+      </w:r>
+      <w:r>
+        <w:t>開</w:t>
+      </w:r>
+      <w:r>
+        <w:t xml:space="preserve"> </w:t>
+      </w:r>
+      <w:r>
+        <w:t>館</w:t>
+      </w:r>
+      <w:r>
+        <w:t xml:space="preserve"> </w:t>
+      </w:r>
+      <w:r>
+        <w:t>時</w:t>
+      </w:r>
+      <w:r>
+        <w:t xml:space="preserve"> </w:t>
+      </w:r>
+      <w:r>
+        <w:t>間：午前</w:t>
+      </w:r>
+      <w:r>
+        <w:t>9</w:t>
+      </w:r>
+      <w:r>
+        <w:t>時</w:t>
+      </w:r>
+      <w:r>
+        <w:t>30</w:t>
+      </w:r>
+      <w:r>
+        <w:t>分〜午後</w:t>
+      </w:r>
+      <w:r>
+        <w:t>5</w:t>
+      </w:r>
+      <w:r>
+        <w:t>時（入館は午後</w:t>
+      </w:r>
+      <w:r>
+        <w:t>4</w:t>
+      </w:r>
+      <w:r>
+        <w:t>時</w:t>
+      </w:r>
+      <w:r>
+        <w:t>30</w:t>
+      </w:r>
+      <w:r>
+        <w:t>分まで）</w:t>
+      </w:r>
+    </w:p>
+    <w:p>
+      <w:pPr>
+        <w:rPr>
+          <w:lang w:eastAsia="zh-TW"/>
+        </w:rPr>
+      </w:pPr>
+      <w:r>
+        <w:t xml:space="preserve">　</w:t>
+      </w:r>
+      <w:r>
+        <w:rPr>
+          <w:lang w:eastAsia="zh-TW"/>
+        </w:rPr>
+        <w:t>主　　　催：大阪市立東洋陶磁美術館</w:t>
+      </w:r>
+    </w:p>
+    <w:p>
+      <w:r>
+        <w:rPr>
+          <w:lang w:eastAsia="zh-TW"/>
+        </w:rPr>
+        <w:t xml:space="preserve">　</w:t>
+      </w:r>
+      <w:r>
+        <w:t>共　　　催：</w:t>
+      </w:r>
+      <w:r>
+        <w:t>NHK</w:t>
+      </w:r>
+      <w:r>
+        <w:t>エンタープライズ近畿</w:t>
+      </w:r>
+    </w:p>
+    <w:p>
+      <w:pPr>
+        <w:rPr>
+          <w:lang w:eastAsia="zh-TW"/>
+        </w:rPr>
+      </w:pPr>
+      <w:r>
+        <w:t xml:space="preserve">　</w:t>
+      </w:r>
+      <w:r>
+        <w:rPr>
+          <w:lang w:eastAsia="zh-TW"/>
+        </w:rPr>
+        <w:t>特</w:t>
+      </w:r>
+      <w:r>
+        <w:rPr>
+          <w:lang w:eastAsia="zh-TW"/>
+        </w:rPr>
+        <w:t xml:space="preserve"> </w:t>
+      </w:r>
+      <w:r>
+        <w:rPr>
+          <w:lang w:eastAsia="zh-TW"/>
+        </w:rPr>
+        <w:t>別</w:t>
+      </w:r>
+      <w:r>
+        <w:rPr>
+          <w:lang w:eastAsia="zh-TW"/>
+        </w:rPr>
+        <w:t xml:space="preserve"> </w:t>
+      </w:r>
+      <w:r>
+        <w:rPr>
+          <w:lang w:eastAsia="zh-TW"/>
+        </w:rPr>
+        <w:t>協</w:t>
+      </w:r>
+      <w:r>
+        <w:rPr>
+          <w:lang w:eastAsia="zh-TW"/>
+        </w:rPr>
+        <w:t xml:space="preserve"> </w:t>
+      </w:r>
+      <w:r>
+        <w:rPr>
+          <w:lang w:eastAsia="zh-TW"/>
+        </w:rPr>
+        <w:t>賛：大同生命保険株式会社</w:t>
+      </w:r>
+    </w:p>
+    <w:p>
+      <w:pPr>
+        <w:rPr>
+          <w:lang w:eastAsia="zh-TW"/>
+        </w:rPr>
+      </w:pPr>
+    </w:p>
     <w:p>
       <w:r>
         <w:rPr>
@@ -184,41 +476,83 @@
     </w:p>
     <w:p>
       <w:r>
-        <w:t xml:space="preserve">　紅葉呉器茶碗　　朝鮮時代・16世紀　　大名物　　１口</w:t>
-      </w:r>
-    </w:p>
-    <!-- 空行 -->
-    <w:p>
-      <w:r>
-        <w:t/>
-      </w:r>
-    </w:p>
-    <!-- 3. 拝借希望期間 -->
-    <w:p>
+        <w:t xml:space="preserve">　紅葉呉器茶碗　　朝鮮時代・</w:t>
+      </w:r>
+      <w:r>
+        <w:t>16</w:t>
+      </w:r>
+      <w:r>
+        <w:t>世紀　　大名物　　１口</w:t>
+      </w:r>
+    </w:p>
+    <w:p/>
+    <w:p>
+      <w:pPr>
+        <w:rPr>
+          <w:lang w:eastAsia="zh-TW"/>
+        </w:rPr>
+      </w:pPr>
       <w:r>
         <w:rPr>
           <w:b/>
-        </w:rPr>
+          <w:lang w:eastAsia="zh-TW"/>
+        </w:rPr>
+        <w:lastRenderedPageBreak/>
         <w:t>３．拝借希望期間</w:t>
       </w:r>
     </w:p>
     <w:p>
-      <w:r>
-        <w:t xml:space="preserve">　2027年３月下旬〜10月上旬（予定）</w:t>
-      </w:r>
-    </w:p>
-    <w:p>
-      <w:r>
-        <w:t xml:space="preserve">　※借用・返却の具体的な日程につきましては、改めてご相談申し上げます。</w:t>
-      </w:r>
-    </w:p>
-    <!-- 空行 -->
-    <w:p>
-      <w:r>
-        <w:t/>
-      </w:r>
-    </w:p>
-    <!-- 4. 作品の保全 -->
+      <w:pPr>
+        <w:rPr>
+          <w:lang w:eastAsia="zh-TW"/>
+        </w:rPr>
+      </w:pPr>
+      <w:r>
+        <w:rPr>
+          <w:lang w:eastAsia="zh-TW"/>
+        </w:rPr>
+        <w:t xml:space="preserve">　</w:t>
+      </w:r>
+      <w:r>
+        <w:rPr>
+          <w:lang w:eastAsia="zh-TW"/>
+        </w:rPr>
+        <w:t>2027</w:t>
+      </w:r>
+      <w:r>
+        <w:rPr>
+          <w:lang w:eastAsia="zh-TW"/>
+        </w:rPr>
+        <w:t>年３月下旬〜</w:t>
+      </w:r>
+      <w:r>
+        <w:rPr>
+          <w:lang w:eastAsia="zh-TW"/>
+        </w:rPr>
+        <w:t>10</w:t>
+      </w:r>
+      <w:r>
+        <w:rPr>
+          <w:lang w:eastAsia="zh-TW"/>
+        </w:rPr>
+        <w:t>月上旬（予定）</w:t>
+      </w:r>
+    </w:p>
+    <w:p>
+      <w:r>
+        <w:rPr>
+          <w:lang w:eastAsia="zh-TW"/>
+        </w:rPr>
+        <w:t xml:space="preserve">　</w:t>
+      </w:r>
+      <w:r>
+        <w:t>※</w:t>
+      </w:r>
+      <w:r>
+        <w:t>借用・返却の具体的な日程につきましては、改めてご相談申し上げます。</w:t>
+      </w:r>
+    </w:p>
+    <w:p/>
     <w:p>
       <w:r>
         <w:rPr>
@@ -232,13 +566,7 @@
         <w:t xml:space="preserve">　ご出品賜りました作品については、拝借から返却までの全期間に保険をお掛けします。また、作品の輸送・展示・保管において、主催者が一切の責任を負うものとし、作品の取り扱いは学芸員と、その指導のもとに美術品輸送専門業者が行います。</w:t>
       </w:r>
     </w:p>
-    <!-- 空行 -->
-    <w:p>
-      <w:r>
-        <w:t/>
-      </w:r>
-    </w:p>
-    <!-- 5. 写真撮影・広報 -->
+    <w:p/>
     <w:p>
       <w:r>
         <w:rPr>
@@ -249,16 +577,16 @@
     </w:p>
     <w:p>
       <w:r>
-        <w:t xml:space="preserve">　展覧会図録制作、会場内画像パネル・映像制作、展覧会の広報目的に限っての印刷物等（ポスター、チラシ、入場券、招待券、看板等）制作、新聞・雑誌等の情報掲載、教育普及、事業報告、インターネット等における写真の利用（SNS含む）、資料用および展示映像制作のための写真・映像撮影、テレビ・雑誌・新聞等各種媒体による映像および写真撮影・放映（作品の一点撮り含む）についても、あわせてご了承くださいますようお願い申し上げます。</w:t>
-      </w:r>
-    </w:p>
-    <!-- 空行 -->
-    <w:p>
-      <w:r>
-        <w:t/>
-      </w:r>
-    </w:p>
-    <!-- 連絡先 -->
+        <w:t xml:space="preserve">　展覧会図録制作、会場内画像パネル・映像制作、展覧会の広報目的に限っての印刷物等（ポスター、チラシ、入場券、招待券、看板等）制作、新聞・雑誌等の情報掲載、教育普及、事業報告、インターネット等における写真の利用（</w:t>
+      </w:r>
+      <w:r>
+        <w:t>SNS</w:t>
+      </w:r>
+      <w:r>
+        <w:t>含む）、資料用および展示映像制作のための写真・映像撮影、テレビ・雑誌・新聞等各種媒体による映像および写真撮影・放映（作品の一点撮り含む）についても、あわせてご了承くださいますようお願い申し上げます。</w:t>
+      </w:r>
+    </w:p>
+    <w:p/>
     <w:p>
       <w:r>
         <w:rPr>
@@ -274,21 +602,39 @@
     </w:p>
     <w:p>
       <w:r>
-        <w:t xml:space="preserve">　〒530-0005　大阪市北区中之島1-1-26</w:t>
-      </w:r>
-    </w:p>
-    <w:p>
-      <w:r>
-        <w:t xml:space="preserve">　電話：06-6223-0058　　E-mail：xiaolin@moco.or.jp</w:t>
-      </w:r>
-    </w:p>
-    <!-- 空行 -->
-    <w:p>
-      <w:r>
-        <w:t/>
-      </w:r>
-    </w:p>
-    <!-- 以上（右寄せ） -->
+        <w:t xml:space="preserve">　〒</w:t>
+      </w:r>
+      <w:r>
+        <w:t>530-0005</w:t>
+      </w:r>
+      <w:r>
+        <w:t xml:space="preserve">　大阪市北区中之島</w:t>
+      </w:r>
+      <w:r>
+        <w:t>1-1-26</w:t>
+      </w:r>
+    </w:p>
+    <w:p>
+      <w:r>
+        <w:t xml:space="preserve">　電話：</w:t>
+      </w:r>
+      <w:r>
+        <w:t>06-6223-0058</w:t>
+      </w:r>
+      <w:r>
+        <w:t xml:space="preserve">　　</w:t>
+      </w:r>
+      <w:r>
+        <w:t>E-mail</w:t>
+      </w:r>
+      <w:r>
+        <w:t>：</w:t>
+      </w:r>
+      <w:r>
+        <w:t>xiaolin@moco.or.jp</w:t>
+      </w:r>
+    </w:p>
+    <w:p/>
     <w:p>
       <w:pPr>
         <w:jc w:val="right"/>
@@ -297,7 +643,14 @@
         <w:t>以　上</w:t>
       </w:r>
     </w:p>
-    <w:sectPr/>
+    <w:p/>
+    <w:sectPr>
+      <w:headerReference w:type="default" r:id="rId8"/>
+      <w:pgSz w:w="11906" w:h="16838" w:code="9"/>
+      <w:pgMar w:top="1985" w:right="1701" w:bottom="1701" w:left="1701" w:header="1021" w:footer="851" w:gutter="0"/>
+      <w:cols w:space="425"/>
+      <w:docGrid w:type="lines" w:linePitch="360"/>
+    </w:sectPr>
   </w:body>
 </w:document>
 </file>

</xml_diff>

<commit_message>
Proofread all three documents with red-marked corrections
Co-Authored-By: Claude Sonnet 4.6 <noreply@anthropic.com>
Claude-Session: https://claude.ai/code/session_01PWM2jbYYXzZe65VxyFNAUN
</commit_message>
<xml_diff>
--- a/出品依頼状_泉屋博古館東京.docx
+++ b/出品依頼状_泉屋博古館東京.docx
@@ -16,19 +16,24 @@
       </w:pPr>
       <w:r>
         <w:rPr>
+          <w:color w:val="000000"/>
           <w:lang w:eastAsia="zh-TW"/>
         </w:rPr>
         <w:t>令和８年</w:t>
       </w:r>
+      <w:proofErr w:type="gramStart"/>
       <w:r>
         <w:rPr>
           <w:rFonts w:hint="eastAsia"/>
+          <w:color w:val="000000"/>
           <w:lang w:eastAsia="zh-TW"/>
         </w:rPr>
         <w:t>７</w:t>
       </w:r>
-      <w:r>
-        <w:rPr>
+      <w:proofErr w:type="gramEnd"/>
+      <w:r>
+        <w:rPr>
+          <w:color w:val="000000"/>
           <w:lang w:eastAsia="zh-TW"/>
         </w:rPr>
         <w:t>月</w:t>
@@ -36,12 +41,14 @@
       <w:r>
         <w:rPr>
           <w:rFonts w:hint="eastAsia"/>
+          <w:color w:val="000000"/>
           <w:lang w:eastAsia="zh-TW"/>
         </w:rPr>
         <w:t xml:space="preserve">　</w:t>
       </w:r>
       <w:r>
         <w:rPr>
+          <w:color w:val="000000"/>
           <w:lang w:eastAsia="zh-TW"/>
         </w:rPr>
         <w:t>日</w:t>
@@ -53,24 +60,66 @@
           <w:lang w:eastAsia="zh-TW"/>
         </w:rPr>
       </w:pPr>
-      <w:r>
-        <w:rPr>
-          <w:lang w:eastAsia="zh-TW"/>
-        </w:rPr>
-        <w:t>泉屋博古館東京</w:t>
-      </w:r>
-    </w:p>
-    <w:p>
-      <w:pPr>
-        <w:rPr>
-          <w:lang w:eastAsia="zh-TW"/>
-        </w:rPr>
-      </w:pPr>
-      <w:r>
-        <w:rPr>
-          <w:lang w:eastAsia="zh-TW"/>
-        </w:rPr>
-        <w:t>館長　野地　耕一郎　様</w:t>
+      <w:proofErr w:type="gramStart"/>
+      <w:r>
+        <w:rPr>
+          <w:color w:val="000000"/>
+          <w:lang w:eastAsia="zh-TW"/>
+        </w:rPr>
+        <w:t>泉屋博古館</w:t>
+      </w:r>
+      <w:proofErr w:type="gramEnd"/>
+      <w:r>
+        <w:rPr>
+          <w:color w:val="000000"/>
+          <w:lang w:eastAsia="zh-TW"/>
+        </w:rPr>
+        <w:t>東京</w:t>
+      </w:r>
+    </w:p>
+    <w:p>
+      <w:pPr>
+        <w:rPr>
+          <w:lang w:eastAsia="zh-TW"/>
+        </w:rPr>
+      </w:pPr>
+      <w:r>
+        <w:rPr>
+          <w:color w:val="000000"/>
+          <w:lang w:eastAsia="zh-TW"/>
+        </w:rPr>
+        <w:t>館長</w:t>
+      </w:r>
+      <w:r>
+        <w:rPr>
+          <w:rFonts w:hint="eastAsia"/>
+          <w:color w:val="000000"/>
+          <w:lang w:eastAsia="zh-TW"/>
+        </w:rPr>
+        <w:t xml:space="preserve">　</w:t>
+      </w:r>
+      <w:r>
+        <w:rPr>
+          <w:color w:val="000000"/>
+          <w:lang w:eastAsia="zh-TW"/>
+        </w:rPr>
+        <w:t>野地　耕</w:t>
+      </w:r>
+      <w:proofErr w:type="gramStart"/>
+      <w:r>
+        <w:rPr>
+          <w:color w:val="000000"/>
+          <w:lang w:eastAsia="zh-TW"/>
+        </w:rPr>
+        <w:t>一</w:t>
+      </w:r>
+      <w:proofErr w:type="gramEnd"/>
+      <w:r>
+        <w:rPr>
+          <w:color w:val="000000"/>
+          <w:lang w:eastAsia="zh-TW"/>
+        </w:rPr>
+        <w:t>郎　様</w:t>
       </w:r>
     </w:p>
     <w:p>
@@ -89,6 +138,7 @@
       </w:pPr>
       <w:r>
         <w:rPr>
+          <w:color w:val="000000"/>
           <w:lang w:eastAsia="zh-TW"/>
         </w:rPr>
         <w:t>大阪市立東洋陶磁美術館</w:t>
@@ -99,6 +149,9 @@
         <w:jc w:val="right"/>
       </w:pPr>
       <w:r>
+        <w:rPr>
+          <w:color w:val="000000"/>
+        </w:rPr>
         <w:t>館長　今井　敦</w:t>
       </w:r>
     </w:p>
@@ -106,544 +159,1111 @@
     <w:p>
       <w:pPr>
         <w:jc w:val="center"/>
-      </w:pPr>
-      <w:r>
         <w:rPr>
           <w:b/>
-        </w:rPr>
-        <w:t>特別展「大坂の豪商・加島屋旧蔵の名宝</w:t>
-      </w:r>
-      <w:r>
-        <w:rPr>
+          <w:color w:val="C00000"/>
+          <w:sz w:val="22"/>
+        </w:rPr>
+      </w:pPr>
+      <w:r>
+        <w:rPr>
+          <w:rFonts w:hint="eastAsia"/>
           <w:b/>
-        </w:rPr>
-        <w:t>―</w:t>
+          <w:color w:val="C00000"/>
+          <w:sz w:val="22"/>
+        </w:rPr>
+        <w:t>大阪市立東洋陶磁美術館</w:t>
       </w:r>
       <w:r>
         <w:rPr>
           <w:b/>
+          <w:color w:val="C00000"/>
+          <w:sz w:val="22"/>
+        </w:rPr>
+        <w:t>受贈記念特別展</w:t>
+      </w:r>
+    </w:p>
+    <w:p>
+      <w:pPr>
+        <w:jc w:val="center"/>
+        <w:rPr>
+          <w:b/>
+          <w:color w:val="000000"/>
+          <w:sz w:val="22"/>
+        </w:rPr>
+      </w:pPr>
+      <w:r>
+        <w:rPr>
+          <w:b/>
+          <w:sz w:val="22"/>
+        </w:rPr>
+        <w:t>「大坂の豪商・加島屋旧蔵の名宝―</w:t>
+      </w:r>
+      <w:r>
+        <w:rPr>
+          <w:b/>
+          <w:sz w:val="22"/>
+          <w:color w:val="FF0000"/>
         </w:rPr>
         <w:t>○つの物語</w:t>
       </w:r>
       <w:r>
         <w:rPr>
           <w:b/>
-        </w:rPr>
-        <w:t>―</w:t>
-      </w:r>
+          <w:sz w:val="22"/>
+        </w:rPr>
+        <w:t>―」（仮称）ご出品のお願い</w:t>
+      </w:r>
+    </w:p>
+    <w:p/>
+    <w:p>
+      <w:r>
+        <w:rPr>
+          <w:color w:val="000000"/>
+        </w:rPr>
+        <w:t>謹啓　時下ますますご清栄のこととお慶び申し上げます。平素より格別のご高配を賜り、厚く御礼申し上げます。</w:t>
+      </w:r>
+    </w:p>
+    <w:p>
+      <w:r>
+        <w:rPr>
+          <w:color w:val="000000"/>
+        </w:rPr>
+        <w:t xml:space="preserve">　このたび、当館では下記の</w:t>
+      </w:r>
+      <w:r>
+        <w:rPr>
+          <w:color w:val="C00000"/>
+        </w:rPr>
+        <w:t>とおり</w:t>
+      </w:r>
+      <w:r>
+        <w:rPr>
+          <w:color w:val="000000"/>
+        </w:rPr>
+        <w:t>特別展を開催する運びとなりました。</w:t>
+      </w:r>
+    </w:p>
+    <w:p>
+      <w:r>
+        <w:rPr>
+          <w:color w:val="000000"/>
+        </w:rPr>
+        <w:t xml:space="preserve">　本展は、大同生命保険株式会社により</w:t>
+      </w:r>
+      <w:r>
+        <w:rPr>
+          <w:color w:val="C00000"/>
+        </w:rPr>
+        <w:t>加島屋（廣岡家）旧蔵品として新たに確認された</w:t>
+      </w:r>
+      <w:r>
+        <w:rPr>
+          <w:color w:val="000000"/>
+        </w:rPr>
+        <w:t>《青磁刻花五爪龍文盤》が当館に寄贈されることを記念し、江戸時代に幕府金融を支え、茶の湯を通じて日本および東洋の名品を蒐集した大坂の豪商・加島屋（廣岡家）ゆかりの名宝を一堂に集めるものです。</w:t>
+      </w:r>
+      <w:r>
+        <w:rPr>
+          <w:color w:val="C00000"/>
+        </w:rPr>
+        <w:t>各作品が加島屋にもたらされ、さらに加島屋を離れて現在の所蔵先へ至るまでの来歴を「物語」として紹介し、その美術史的価値と歴史的意義を明らかにいたします。</w:t>
+      </w:r>
+    </w:p>
+    <w:p>
+      <w:r>
+        <w:rPr/>
+        <w:t>　つきましては、本展の趣旨をお汲み取りいただき、</w:t>
+      </w:r>
+      <w:r>
+        <w:rPr/>
+        <w:t>貴館ご所蔵の下記作品をご出品賜りますよう、</w:t>
+      </w:r>
+      <w:r>
+        <w:rPr>
+          <w:color w:val="FF0000"/>
+        </w:rPr>
+        <w:t>何卒よろしくお願い申し上げます。</w:t>
+      </w:r>
+    </w:p>
+    <w:p>
+      <w:pPr>
+        <w:jc w:val="right"/>
+      </w:pPr>
+      <w:r>
+        <w:rPr>
+          <w:color w:val="000000"/>
+        </w:rPr>
+        <w:t>謹白</w:t>
+      </w:r>
+    </w:p>
+    <w:p/>
+    <w:p>
+      <w:pPr>
+        <w:jc w:val="center"/>
+      </w:pPr>
+      <w:r>
+        <w:rPr>
+          <w:color w:val="000000"/>
+        </w:rPr>
+        <w:t>記</w:t>
+      </w:r>
+    </w:p>
+    <w:p/>
+    <w:p>
       <w:r>
         <w:rPr>
           <w:b/>
-        </w:rPr>
-        <w:t>」（仮称）ご出品のお願い</w:t>
+          <w:color w:val="000000"/>
+        </w:rPr>
+        <w:t>１．展覧会概要</w:t>
+      </w:r>
+    </w:p>
+    <w:p>
+      <w:r>
+        <w:rPr/>
+        <w:t>　展覧会名称：</w:t>
+      </w:r>
+      <w:r>
+        <w:rPr/>
+        <w:t>受贈記念特別展「大坂の豪商・加島屋旧蔵の名宝―</w:t>
+      </w:r>
+      <w:r>
+        <w:rPr>
+          <w:color w:val="FF0000"/>
+        </w:rPr>
+        <w:t>○つの物語</w:t>
+      </w:r>
+      <w:r>
+        <w:rPr/>
+        <w:t>―」（仮称）</w:t>
+      </w:r>
+    </w:p>
+    <w:p>
+      <w:pPr>
+        <w:rPr>
+          <w:lang w:eastAsia="zh-CN"/>
+        </w:rPr>
+      </w:pPr>
+      <w:r>
+        <w:rPr>
+          <w:color w:val="000000"/>
+        </w:rPr>
+        <w:t xml:space="preserve">　</w:t>
+      </w:r>
+      <w:r>
+        <w:rPr>
+          <w:color w:val="000000"/>
+          <w:lang w:eastAsia="zh-CN"/>
+        </w:rPr>
+        <w:t xml:space="preserve">会　　</w:t>
+      </w:r>
+      <w:proofErr w:type="gramStart"/>
+      <w:r>
+        <w:rPr>
+          <w:color w:val="000000"/>
+          <w:lang w:eastAsia="zh-CN"/>
+        </w:rPr>
+        <w:t xml:space="preserve">　</w:t>
+      </w:r>
+      <w:proofErr w:type="gramEnd"/>
+      <w:r>
+        <w:rPr>
+          <w:color w:val="000000"/>
+          <w:lang w:eastAsia="zh-CN"/>
+        </w:rPr>
+        <w:t>期：</w:t>
+      </w:r>
+      <w:r>
+        <w:rPr>
+          <w:color w:val="000000"/>
+          <w:lang w:eastAsia="zh-CN"/>
+        </w:rPr>
+        <w:t>2027</w:t>
+      </w:r>
+      <w:r>
+        <w:rPr>
+          <w:color w:val="000000"/>
+          <w:lang w:eastAsia="zh-CN"/>
+        </w:rPr>
+        <w:t>年４月</w:t>
+      </w:r>
+      <w:r>
+        <w:rPr>
+          <w:color w:val="000000"/>
+          <w:lang w:eastAsia="zh-CN"/>
+        </w:rPr>
+        <w:t>17</w:t>
+      </w:r>
+      <w:r>
+        <w:rPr>
+          <w:color w:val="000000"/>
+          <w:lang w:eastAsia="zh-CN"/>
+        </w:rPr>
+        <w:t>日（土）〜９月</w:t>
+      </w:r>
+      <w:r>
+        <w:rPr>
+          <w:color w:val="000000"/>
+          <w:lang w:eastAsia="zh-CN"/>
+        </w:rPr>
+        <w:t>26</w:t>
+      </w:r>
+      <w:r>
+        <w:rPr>
+          <w:color w:val="000000"/>
+          <w:lang w:eastAsia="zh-CN"/>
+        </w:rPr>
+        <w:t>日（日）</w:t>
+      </w:r>
+    </w:p>
+    <w:p>
+      <w:pPr>
+        <w:rPr>
+          <w:lang w:eastAsia="zh-TW"/>
+        </w:rPr>
+      </w:pPr>
+      <w:r>
+        <w:rPr>
+          <w:color w:val="000000"/>
+          <w:lang w:eastAsia="zh-CN"/>
+        </w:rPr>
+        <w:t xml:space="preserve">　</w:t>
+      </w:r>
+      <w:r>
+        <w:rPr>
+          <w:color w:val="000000"/>
+          <w:lang w:eastAsia="zh-TW"/>
+        </w:rPr>
+        <w:t>会　　　場：大阪市立東洋陶磁美術館</w:t>
+      </w:r>
+      <w:proofErr w:type="gramStart"/>
+      <w:r>
+        <w:rPr>
+          <w:color w:val="000000"/>
+          <w:lang w:eastAsia="zh-TW"/>
+        </w:rPr>
+        <w:t>（〒</w:t>
+      </w:r>
+      <w:proofErr w:type="gramEnd"/>
+      <w:r>
+        <w:rPr>
+          <w:color w:val="000000"/>
+          <w:lang w:eastAsia="zh-TW"/>
+        </w:rPr>
+        <w:t>530-0005</w:t>
+      </w:r>
+      <w:r>
+        <w:rPr>
+          <w:color w:val="000000"/>
+          <w:lang w:eastAsia="zh-TW"/>
+        </w:rPr>
+        <w:t xml:space="preserve">　大阪市北区中之島</w:t>
+      </w:r>
+      <w:r>
+        <w:rPr>
+          <w:color w:val="000000"/>
+          <w:lang w:eastAsia="zh-TW"/>
+        </w:rPr>
+        <w:t>1-1-26</w:t>
+      </w:r>
+      <w:r>
+        <w:rPr>
+          <w:color w:val="000000"/>
+          <w:lang w:eastAsia="zh-TW"/>
+        </w:rPr>
+        <w:t>）</w:t>
+      </w:r>
+    </w:p>
+    <w:p>
+      <w:r>
+        <w:rPr>
+          <w:color w:val="000000"/>
+          <w:lang w:eastAsia="zh-TW"/>
+        </w:rPr>
+        <w:t xml:space="preserve">　</w:t>
+      </w:r>
+      <w:r>
+        <w:rPr>
+          <w:color w:val="000000"/>
+        </w:rPr>
+        <w:t>開</w:t>
+      </w:r>
+      <w:r>
+        <w:rPr>
+          <w:color w:val="000000"/>
+        </w:rPr>
+        <w:t xml:space="preserve"> </w:t>
+      </w:r>
+      <w:r>
+        <w:rPr>
+          <w:color w:val="000000"/>
+        </w:rPr>
+        <w:t>館</w:t>
+      </w:r>
+      <w:r>
+        <w:rPr>
+          <w:color w:val="000000"/>
+        </w:rPr>
+        <w:t xml:space="preserve"> </w:t>
+      </w:r>
+      <w:r>
+        <w:rPr>
+          <w:color w:val="000000"/>
+        </w:rPr>
+        <w:t>時</w:t>
+      </w:r>
+      <w:r>
+        <w:rPr>
+          <w:color w:val="000000"/>
+        </w:rPr>
+        <w:t xml:space="preserve"> </w:t>
+      </w:r>
+      <w:r>
+        <w:rPr>
+          <w:color w:val="000000"/>
+        </w:rPr>
+        <w:t>間：午前</w:t>
+      </w:r>
+      <w:r>
+        <w:rPr>
+          <w:color w:val="000000"/>
+        </w:rPr>
+        <w:t>9</w:t>
+      </w:r>
+      <w:r>
+        <w:rPr>
+          <w:color w:val="000000"/>
+        </w:rPr>
+        <w:t>時</w:t>
+      </w:r>
+      <w:r>
+        <w:rPr>
+          <w:color w:val="000000"/>
+        </w:rPr>
+        <w:t>30</w:t>
+      </w:r>
+      <w:r>
+        <w:rPr>
+          <w:color w:val="000000"/>
+        </w:rPr>
+        <w:t>分〜午後</w:t>
+      </w:r>
+      <w:r>
+        <w:rPr>
+          <w:color w:val="000000"/>
+        </w:rPr>
+        <w:t>5</w:t>
+      </w:r>
+      <w:r>
+        <w:rPr>
+          <w:color w:val="000000"/>
+        </w:rPr>
+        <w:t>時（入館は午後</w:t>
+      </w:r>
+      <w:r>
+        <w:rPr>
+          <w:color w:val="000000"/>
+        </w:rPr>
+        <w:t>4</w:t>
+      </w:r>
+      <w:r>
+        <w:rPr>
+          <w:color w:val="000000"/>
+        </w:rPr>
+        <w:t>時</w:t>
+      </w:r>
+      <w:r>
+        <w:rPr>
+          <w:color w:val="000000"/>
+        </w:rPr>
+        <w:t>30</w:t>
+      </w:r>
+      <w:r>
+        <w:rPr>
+          <w:color w:val="000000"/>
+        </w:rPr>
+        <w:t>分まで）</w:t>
+      </w:r>
+    </w:p>
+    <w:p>
+      <w:pPr>
+        <w:rPr>
+          <w:lang w:eastAsia="zh-TW"/>
+        </w:rPr>
+      </w:pPr>
+      <w:r>
+        <w:rPr>
+          <w:color w:val="C00000"/>
+        </w:rPr>
+        <w:t xml:space="preserve">　</w:t>
+      </w:r>
+      <w:r>
+        <w:rPr>
+          <w:color w:val="C00000"/>
+          <w:lang w:eastAsia="zh-TW"/>
+        </w:rPr>
+        <w:t>休　館　日：月</w:t>
+      </w:r>
+      <w:proofErr w:type="gramStart"/>
+      <w:r>
+        <w:rPr>
+          <w:color w:val="C00000"/>
+          <w:lang w:eastAsia="zh-TW"/>
+        </w:rPr>
+        <w:t>曜</w:t>
+      </w:r>
+      <w:proofErr w:type="gramEnd"/>
+      <w:r>
+        <w:rPr>
+          <w:color w:val="C00000"/>
+          <w:lang w:eastAsia="zh-TW"/>
+        </w:rPr>
+        <w:t>日、</w:t>
+      </w:r>
+      <w:r>
+        <w:rPr>
+          <w:color w:val="C00000"/>
+          <w:lang w:eastAsia="zh-TW"/>
+        </w:rPr>
+        <w:t>5</w:t>
+      </w:r>
+      <w:r>
+        <w:rPr>
+          <w:color w:val="C00000"/>
+          <w:lang w:eastAsia="zh-TW"/>
+        </w:rPr>
+        <w:t>月</w:t>
+      </w:r>
+      <w:r>
+        <w:rPr>
+          <w:color w:val="C00000"/>
+          <w:lang w:eastAsia="zh-TW"/>
+        </w:rPr>
+        <w:t>6</w:t>
+      </w:r>
+      <w:r>
+        <w:rPr>
+          <w:color w:val="C00000"/>
+          <w:lang w:eastAsia="zh-TW"/>
+        </w:rPr>
+        <w:t>日（木）、</w:t>
+      </w:r>
+      <w:r>
+        <w:rPr>
+          <w:color w:val="C00000"/>
+          <w:lang w:eastAsia="zh-TW"/>
+        </w:rPr>
+        <w:t>7</w:t>
+      </w:r>
+      <w:r>
+        <w:rPr>
+          <w:color w:val="C00000"/>
+          <w:lang w:eastAsia="zh-TW"/>
+        </w:rPr>
+        <w:t>月</w:t>
+      </w:r>
+      <w:r>
+        <w:rPr>
+          <w:color w:val="C00000"/>
+          <w:lang w:eastAsia="zh-TW"/>
+        </w:rPr>
+        <w:t>20</w:t>
+      </w:r>
+      <w:r>
+        <w:rPr>
+          <w:color w:val="C00000"/>
+          <w:lang w:eastAsia="zh-TW"/>
+        </w:rPr>
+        <w:t>日（火）、</w:t>
+      </w:r>
+      <w:r>
+        <w:rPr>
+          <w:color w:val="C00000"/>
+          <w:lang w:eastAsia="zh-TW"/>
+        </w:rPr>
+        <w:t>9</w:t>
+      </w:r>
+      <w:r>
+        <w:rPr>
+          <w:color w:val="C00000"/>
+          <w:lang w:eastAsia="zh-TW"/>
+        </w:rPr>
+        <w:t>月</w:t>
+      </w:r>
+      <w:r>
+        <w:rPr>
+          <w:color w:val="C00000"/>
+          <w:lang w:eastAsia="zh-TW"/>
+        </w:rPr>
+        <w:t>21</w:t>
+      </w:r>
+      <w:r>
+        <w:rPr>
+          <w:color w:val="C00000"/>
+          <w:lang w:eastAsia="zh-TW"/>
+        </w:rPr>
+        <w:t>日（火）（</w:t>
+      </w:r>
+      <w:proofErr w:type="gramStart"/>
+      <w:r>
+        <w:rPr>
+          <w:color w:val="C00000"/>
+          <w:lang w:eastAsia="zh-TW"/>
+        </w:rPr>
+        <w:t>予定</w:t>
+      </w:r>
+      <w:proofErr w:type="gramEnd"/>
+      <w:r>
+        <w:rPr>
+          <w:color w:val="C00000"/>
+          <w:lang w:eastAsia="zh-TW"/>
+        </w:rPr>
+        <w:t>）</w:t>
+      </w:r>
+    </w:p>
+    <w:p>
+      <w:pPr>
+        <w:rPr>
+          <w:lang w:eastAsia="zh-TW"/>
+        </w:rPr>
+      </w:pPr>
+      <w:r>
+        <w:rPr>
+          <w:color w:val="000000"/>
+          <w:lang w:eastAsia="zh-TW"/>
+        </w:rPr>
+        <w:t xml:space="preserve">　主　　　催：大阪市立東洋陶磁美術館</w:t>
+      </w:r>
+    </w:p>
+    <w:p>
+      <w:r>
+        <w:rPr>
+          <w:color w:val="000000"/>
+          <w:lang w:eastAsia="zh-TW"/>
+        </w:rPr>
+        <w:t xml:space="preserve">　</w:t>
+      </w:r>
+      <w:r>
+        <w:rPr>
+          <w:color w:val="000000"/>
+        </w:rPr>
+        <w:t>共　　　催：</w:t>
+      </w:r>
+      <w:r>
+        <w:rPr>
+          <w:color w:val="000000"/>
+        </w:rPr>
+        <w:t>NHK</w:t>
+      </w:r>
+      <w:r>
+        <w:rPr>
+          <w:color w:val="000000"/>
+        </w:rPr>
+        <w:t>エンタープライズ近畿</w:t>
+      </w:r>
+    </w:p>
+    <w:p>
+      <w:r>
+        <w:rPr>
+          <w:color w:val="000000"/>
+        </w:rPr>
+        <w:t xml:space="preserve">　後　　　援：</w:t>
+      </w:r>
+      <w:r>
+        <w:rPr>
+          <w:color w:val="C00000"/>
+        </w:rPr>
+        <w:t>NHK</w:t>
+      </w:r>
+      <w:r>
+        <w:rPr>
+          <w:color w:val="C00000"/>
+        </w:rPr>
+        <w:t>大阪放送局（予定）、大阪商工会議所（予定）</w:t>
+      </w:r>
+    </w:p>
+    <w:p>
+      <w:pPr>
+        <w:rPr>
+          <w:rFonts w:hint="eastAsia"/>
+        </w:rPr>
+      </w:pPr>
+      <w:r>
+        <w:rPr>
+          <w:color w:val="000000"/>
+        </w:rPr>
+        <w:t xml:space="preserve">　</w:t>
+      </w:r>
+      <w:r>
+        <w:rPr>
+          <w:color w:val="000000"/>
+          <w:lang w:eastAsia="zh-TW"/>
+        </w:rPr>
+        <w:t>特</w:t>
+      </w:r>
+      <w:r>
+        <w:rPr>
+          <w:color w:val="000000"/>
+          <w:lang w:eastAsia="zh-TW"/>
+        </w:rPr>
+        <w:t xml:space="preserve"> </w:t>
+      </w:r>
+      <w:r>
+        <w:rPr>
+          <w:color w:val="000000"/>
+          <w:lang w:eastAsia="zh-TW"/>
+        </w:rPr>
+        <w:t>別</w:t>
+      </w:r>
+      <w:r>
+        <w:rPr>
+          <w:color w:val="000000"/>
+          <w:lang w:eastAsia="zh-TW"/>
+        </w:rPr>
+        <w:t xml:space="preserve"> </w:t>
+      </w:r>
+      <w:r>
+        <w:rPr>
+          <w:color w:val="000000"/>
+          <w:lang w:eastAsia="zh-TW"/>
+        </w:rPr>
+        <w:t>協</w:t>
+      </w:r>
+      <w:r>
+        <w:rPr>
+          <w:color w:val="000000"/>
+          <w:lang w:eastAsia="zh-TW"/>
+        </w:rPr>
+        <w:t xml:space="preserve"> </w:t>
+      </w:r>
+      <w:r>
+        <w:rPr>
+          <w:color w:val="000000"/>
+          <w:lang w:eastAsia="zh-TW"/>
+        </w:rPr>
+        <w:t>賛：大同生命保険株式会社</w:t>
+      </w:r>
+    </w:p>
+    <w:p>
+      <w:r>
+        <w:rPr>
+          <w:b/>
+          <w:color w:val="000000"/>
+        </w:rPr>
+        <w:lastRenderedPageBreak/>
+        <w:t>２．拝借希望作品</w:t>
+      </w:r>
+    </w:p>
+    <w:p>
+      <w:pPr>
+        <w:rPr>
+          <w:color w:val="000000"/>
+        </w:rPr>
+      </w:pPr>
+      <w:r>
+        <w:rPr>
+          <w:color w:val="000000"/>
+        </w:rPr>
+        <w:t xml:space="preserve">　《紅葉呉器茶碗》　朝鮮時代・</w:t>
+      </w:r>
+      <w:r>
+        <w:rPr>
+          <w:color w:val="000000"/>
+        </w:rPr>
+        <w:t>16</w:t>
+      </w:r>
+      <w:r>
+        <w:rPr>
+          <w:color w:val="000000"/>
+        </w:rPr>
+        <w:t>世紀　　大名物　　１口</w:t>
+      </w:r>
+    </w:p>
+    <w:p>
+      <w:pPr>
+        <w:jc w:val="right"/>
+        <w:rPr>
+          <w:lang w:eastAsia="zh-TW"/>
+        </w:rPr>
+      </w:pPr>
+      <w:proofErr w:type="gramStart"/>
+      <w:proofErr w:type="gramEnd"/>
+      <w:proofErr w:type="gramStart"/>
+      <w:proofErr w:type="gramEnd"/>
+      <w:r>
+        <w:rPr>
+          <w:lang w:eastAsia="zh-TW"/>
+        </w:rPr>
+        <w:t>（大阪美術倶楽部「広岡家蔵品入札」</w:t>
+      </w:r>
+      <w:r>
+        <w:rPr>
+          <w:lang w:eastAsia="zh-TW"/>
+          <w:color w:val="FF0000"/>
+        </w:rPr>
+        <w:t>（昭和3年）</w:t>
+      </w:r>
+      <w:r>
+        <w:rPr>
+          <w:lang w:eastAsia="zh-TW"/>
+        </w:rPr>
+        <w:t>出品No.91）</w:t>
+      </w:r>
+    </w:p>
+    <w:p>
+      <w:pPr>
+        <w:rPr>
+          <w:lang w:eastAsia="zh-TW"/>
+        </w:rPr>
+      </w:pPr>
+    </w:p>
+    <w:p>
+      <w:pPr>
+        <w:rPr>
+          <w:lang w:eastAsia="zh-TW"/>
+        </w:rPr>
+      </w:pPr>
+      <w:r>
+        <w:rPr>
+          <w:b/>
+          <w:color w:val="000000"/>
+          <w:lang w:eastAsia="zh-TW"/>
+        </w:rPr>
+        <w:t>３．拝借希望期間</w:t>
+      </w:r>
+    </w:p>
+    <w:p>
+      <w:pPr>
+        <w:rPr>
+          <w:lang w:eastAsia="zh-TW"/>
+        </w:rPr>
+      </w:pPr>
+      <w:r>
+        <w:rPr>
+          <w:color w:val="000000"/>
+          <w:lang w:eastAsia="zh-TW"/>
+        </w:rPr>
+        <w:t xml:space="preserve">　</w:t>
+      </w:r>
+      <w:r>
+        <w:rPr>
+          <w:color w:val="000000"/>
+          <w:lang w:eastAsia="zh-TW"/>
+        </w:rPr>
+        <w:t>2027</w:t>
+      </w:r>
+      <w:r>
+        <w:rPr>
+          <w:color w:val="000000"/>
+          <w:lang w:eastAsia="zh-TW"/>
+        </w:rPr>
+        <w:t>年</w:t>
+      </w:r>
+      <w:proofErr w:type="gramStart"/>
+      <w:r>
+        <w:rPr>
+          <w:color w:val="000000"/>
+          <w:lang w:eastAsia="zh-TW"/>
+        </w:rPr>
+        <w:t>３</w:t>
+      </w:r>
+      <w:proofErr w:type="gramEnd"/>
+      <w:r>
+        <w:rPr>
+          <w:color w:val="000000"/>
+          <w:lang w:eastAsia="zh-TW"/>
+        </w:rPr>
+        <w:t>月下旬〜</w:t>
+      </w:r>
+      <w:r>
+        <w:rPr>
+          <w:color w:val="000000"/>
+          <w:lang w:eastAsia="zh-TW"/>
+        </w:rPr>
+        <w:t>10</w:t>
+      </w:r>
+      <w:r>
+        <w:rPr>
+          <w:color w:val="000000"/>
+          <w:lang w:eastAsia="zh-TW"/>
+        </w:rPr>
+        <w:t>月上旬（</w:t>
+      </w:r>
+      <w:proofErr w:type="gramStart"/>
+      <w:r>
+        <w:rPr>
+          <w:color w:val="000000"/>
+          <w:lang w:eastAsia="zh-TW"/>
+        </w:rPr>
+        <w:t>予定</w:t>
+      </w:r>
+      <w:proofErr w:type="gramEnd"/>
+      <w:r>
+        <w:rPr>
+          <w:color w:val="000000"/>
+          <w:lang w:eastAsia="zh-TW"/>
+        </w:rPr>
+        <w:t>）</w:t>
+      </w:r>
+    </w:p>
+    <w:p>
+      <w:r>
+        <w:rPr>
+          <w:color w:val="000000"/>
+          <w:lang w:eastAsia="zh-TW"/>
+        </w:rPr>
+        <w:t xml:space="preserve">　</w:t>
+      </w:r>
+      <w:r>
+        <w:rPr>
+          <w:color w:val="000000"/>
+        </w:rPr>
+        <w:t>※</w:t>
+      </w:r>
+      <w:r>
+        <w:rPr>
+          <w:color w:val="000000"/>
+        </w:rPr>
+        <w:t>借用・返却の具体的な日程につきましては、改めてご相談申し上げます。</w:t>
       </w:r>
     </w:p>
     <w:p/>
     <w:p>
       <w:r>
-        <w:t>謹啓　時下ますますご清栄のこととお慶び申し上げます。平素より格別のご高配を賜り、厚く御礼申し上げます。</w:t>
-      </w:r>
-    </w:p>
-    <w:p>
-      <w:r>
-        <w:t xml:space="preserve">　このたび、当館では</w:t>
-      </w:r>
+        <w:rPr>
+          <w:b/>
+          <w:color w:val="000000"/>
+        </w:rPr>
+        <w:t>４．作品の保全</w:t>
+      </w:r>
+    </w:p>
+    <w:p>
+      <w:r>
+        <w:rPr/>
+        <w:t>　ご出品賜りました作品については、</w:t>
+      </w:r>
+      <w:r>
+        <w:rPr/>
+        <w:t>借用から返却までの全期間、当館において</w:t>
+      </w:r>
+      <w:r>
+        <w:rPr>
+          <w:color w:val="FF0000"/>
+        </w:rPr>
+        <w:t>付保いたします。</w:t>
+      </w:r>
+      <w:r>
+        <w:rPr/>
+        <w:t>また、作品の輸送・展示・保管にあたっては、主催者が責任をもって管理し、作品の取り扱いは、当館学芸員の立会いおよび指導のもと、美術品輸送専門業者が行います。</w:t>
+      </w:r>
+    </w:p>
+    <w:p/>
+    <w:p>
+      <w:r>
+        <w:rPr>
+          <w:b/>
+          <w:color w:val="000000"/>
+        </w:rPr>
+        <w:t>５．写真撮影・広報用資料掲載</w:t>
+      </w:r>
+    </w:p>
+    <w:p>
+      <w:r>
+        <w:rPr>
+          <w:color w:val="C00000"/>
+        </w:rPr>
+        <w:t xml:space="preserve">　展覧会関連書籍の制作（求龍堂発行予定）、会場内画像パネル・映像制作、広報印刷物（ポスター、チラシ、入場券、招待券、看板等）、新聞・雑誌等での情報掲載、教育普及、事業報告、当館ウェブサイト・</w:t>
+      </w:r>
+      <w:r>
+        <w:rPr>
+          <w:color w:val="C00000"/>
+        </w:rPr>
+        <w:t>SNS</w:t>
+      </w:r>
+      <w:r>
+        <w:rPr>
+          <w:color w:val="C00000"/>
+        </w:rPr>
+        <w:t>等での広報における作品画像の利用につきまして、展覧会および関連事業の目的に限り、あわせてご許可賜りますようお願い申し上げます。</w:t>
+      </w:r>
+    </w:p>
+    <w:p>
+      <w:pPr>
+        <w:ind w:firstLineChars="100" w:firstLine="210"/>
+      </w:pPr>
+      <w:r>
+        <w:rPr>
+          <w:color w:val="000000"/>
+        </w:rPr>
+        <w:t xml:space="preserve">　また、広報・教育普及用資料および展覧会関連書籍等への掲載を目的として、</w:t>
+      </w:r>
+      <w:r>
+        <w:rPr>
+          <w:color w:val="C00000"/>
+        </w:rPr>
+        <w:t>写真家・六田知弘氏による拝借作品の新規撮影につきましても、ご許可賜りますようお願い申し上げます。撮影データは、撮影後に貴館へ提供し、貴館においてもご活用いただけるものといたします。</w:t>
+      </w:r>
+    </w:p>
+    <w:p>
+      <w:pPr>
+        <w:ind w:firstLineChars="100" w:firstLine="210"/>
+      </w:pPr>
+      <w:r>
+        <w:rPr>
+          <w:color w:val="000000"/>
+        </w:rPr>
+        <w:t xml:space="preserve">　なお、当館では来館者による展示品の撮影を許可しております。</w:t>
+      </w:r>
+      <w:r>
+        <w:rPr>
+          <w:color w:val="C00000"/>
+        </w:rPr>
+        <w:t>貴館のご方針に差し支えない範囲で、本作品についても来館者撮影をご許可いただけますよう、何卒ご検討のほどお願い申し上げます。</w:t>
+      </w:r>
+    </w:p>
+    <w:p/>
+    <w:p>
       <w:r>
         <w:rPr>
           <w:rFonts w:hint="eastAsia"/>
         </w:rPr>
-        <w:t>別紙の</w:t>
-      </w:r>
-      <w:r>
-        <w:t>通り特別展を開催する運びとなりました。</w:t>
-      </w:r>
-    </w:p>
-    <w:p>
-      <w:r>
-        <w:t xml:space="preserve">　本展は、大同生命保険株式会社により新たに見出された加島屋旧蔵《青磁刻花五爪龍文盤》が当館に寄贈され</w:t>
-      </w:r>
-      <w:r>
+        <w:t>６．その他</w:t>
+      </w:r>
+    </w:p>
+    <w:p>
+      <w:pPr>
+        <w:rPr>
+          <w:color w:val="C00000"/>
+        </w:rPr>
+      </w:pPr>
+      <w:r>
+        <w:rPr>
+          <w:color w:val="C00000"/>
+        </w:rPr>
+        <w:t xml:space="preserve">　</w:t>
+      </w:r>
+      <w:r>
+        <w:rPr>
+          <w:color w:val="C00000"/>
+        </w:rPr>
+        <w:t>ご出品にあたりましては、貴館のご規定による条件を遵守し、詳細につきましては担当者間で協議のうえ進めてまいります。</w:t>
+      </w:r>
+    </w:p>
+    <w:p>
+      <w:pPr>
         <w:rPr>
           <w:rFonts w:hint="eastAsia"/>
         </w:rPr>
-        <w:t>る</w:t>
-      </w:r>
-      <w:r>
-        <w:t>ことを記念し、江戸時代の幕府金融を担い、数多くの東洋の名品を蒐集した大坂の豪商・加島屋（廣岡家）ゆかりの名宝を一堂に集めるものです。各作品が加島屋へ伝わるまでの経緯、そして加島屋を離れ現在の所蔵先へ至るまでのそれぞれの来歴を「○つの物語」として紹介し、その魅力と歴史的意義をひもとく展覧会です。</w:t>
-      </w:r>
-    </w:p>
-    <w:p>
-      <w:r>
-        <w:t xml:space="preserve">　つきましては、本展の趣旨をお汲み取りいただき、貴館ご所蔵の下記作品をご出品賜りますよう、何卒よろしくお願い申し上げます。</w:t>
-      </w:r>
-    </w:p>
-    <w:p>
-      <w:pPr>
+      </w:pPr>
+    </w:p>
+    <w:p>
+      <w:r>
+        <w:rPr>
+          <w:b/>
+          <w:color w:val="000000"/>
+        </w:rPr>
+        <w:t>〈担当・連絡先〉</w:t>
+      </w:r>
+    </w:p>
+    <w:p>
+      <w:r>
+        <w:rPr>
+          <w:color w:val="000000"/>
+        </w:rPr>
+        <w:t xml:space="preserve">　大阪市立東洋陶磁美術館　学芸課（担当：小林　仁）</w:t>
+      </w:r>
+    </w:p>
+    <w:p>
+      <w:pPr>
+        <w:rPr>
+          <w:lang w:eastAsia="zh-TW"/>
+        </w:rPr>
+      </w:pPr>
+      <w:r>
+        <w:rPr>
+          <w:color w:val="000000"/>
+        </w:rPr>
+        <w:t xml:space="preserve">　</w:t>
+      </w:r>
+      <w:proofErr w:type="gramStart"/>
+      <w:r>
+        <w:rPr>
+          <w:color w:val="000000"/>
+          <w:lang w:eastAsia="zh-TW"/>
+        </w:rPr>
+        <w:t>〒</w:t>
+      </w:r>
+      <w:proofErr w:type="gramEnd"/>
+      <w:r>
+        <w:rPr>
+          <w:color w:val="000000"/>
+          <w:lang w:eastAsia="zh-TW"/>
+        </w:rPr>
+        <w:t>530-0005</w:t>
+      </w:r>
+      <w:r>
+        <w:rPr>
+          <w:color w:val="000000"/>
+          <w:lang w:eastAsia="zh-TW"/>
+        </w:rPr>
+        <w:t xml:space="preserve">　大阪市北区中之島</w:t>
+      </w:r>
+      <w:r>
+        <w:rPr>
+          <w:color w:val="000000"/>
+          <w:lang w:eastAsia="zh-TW"/>
+        </w:rPr>
+        <w:t>1-1-26</w:t>
+      </w:r>
+    </w:p>
+    <w:p>
+      <w:pPr>
+        <w:rPr>
+          <w:lang w:eastAsia="zh-TW"/>
+        </w:rPr>
+      </w:pPr>
+      <w:r>
+        <w:rPr>
+          <w:color w:val="000000"/>
+          <w:lang w:eastAsia="zh-TW"/>
+        </w:rPr>
+        <w:t xml:space="preserve">　電話：</w:t>
+      </w:r>
+      <w:r>
+        <w:rPr>
+          <w:color w:val="000000"/>
+          <w:lang w:eastAsia="zh-TW"/>
+        </w:rPr>
+        <w:t>06-6223-0058</w:t>
+      </w:r>
+    </w:p>
+    <w:p>
+      <w:pPr>
+        <w:ind w:firstLineChars="100" w:firstLine="210"/>
+      </w:pPr>
+      <w:r>
+        <w:rPr>
+          <w:color w:val="FF0000"/>
+        </w:rPr>
+        <w:t>　E-mail：xiaolin@moco.or.jp</w:t>
+      </w:r>
+    </w:p>
+    <w:p>
+      <w:pPr>
+        <w:ind w:right="840"/>
         <w:jc w:val="right"/>
-      </w:pPr>
-      <w:r>
-        <w:t>謹白</w:t>
-      </w:r>
-    </w:p>
-    <w:p/>
-    <w:p>
-      <w:pPr>
-        <w:jc w:val="center"/>
-      </w:pPr>
-      <w:r>
-        <w:t>記</w:t>
-      </w:r>
-    </w:p>
-    <w:p/>
-    <w:p>
-      <w:r>
-        <w:rPr>
-          <w:b/>
-        </w:rPr>
-        <w:t>１．展覧会概要</w:t>
-      </w:r>
-    </w:p>
-    <w:p>
-      <w:r>
-        <w:t xml:space="preserve">　展覧会名称：受贈記念特別展「大坂の豪商・加島屋旧蔵の名宝</w:t>
-      </w:r>
-      <w:r>
-        <w:t>―</w:t>
-      </w:r>
-      <w:r>
-        <w:t>○つの物語</w:t>
-      </w:r>
-      <w:r>
-        <w:t>―</w:t>
-      </w:r>
-      <w:r>
-        <w:t>」（仮称）</w:t>
-      </w:r>
-    </w:p>
-    <w:p>
-      <w:pPr>
-        <w:rPr>
-          <w:lang w:eastAsia="zh-CN"/>
-        </w:rPr>
-      </w:pPr>
-      <w:r>
-        <w:t xml:space="preserve">　</w:t>
-      </w:r>
-      <w:r>
-        <w:rPr>
-          <w:lang w:eastAsia="zh-CN"/>
-        </w:rPr>
-        <w:t>会　　　期：</w:t>
-      </w:r>
-      <w:r>
-        <w:rPr>
-          <w:lang w:eastAsia="zh-CN"/>
-        </w:rPr>
-        <w:t>2027</w:t>
-      </w:r>
-      <w:r>
-        <w:rPr>
-          <w:lang w:eastAsia="zh-CN"/>
-        </w:rPr>
-        <w:t>年４月</w:t>
-      </w:r>
-      <w:r>
-        <w:rPr>
-          <w:lang w:eastAsia="zh-CN"/>
-        </w:rPr>
-        <w:t>17</w:t>
-      </w:r>
-      <w:r>
-        <w:rPr>
-          <w:lang w:eastAsia="zh-CN"/>
-        </w:rPr>
-        <w:t>日（土）〜９月</w:t>
-      </w:r>
-      <w:r>
-        <w:rPr>
-          <w:lang w:eastAsia="zh-CN"/>
-        </w:rPr>
-        <w:t>26</w:t>
-      </w:r>
-      <w:r>
-        <w:rPr>
-          <w:lang w:eastAsia="zh-CN"/>
-        </w:rPr>
-        <w:t>日（日）</w:t>
-      </w:r>
-    </w:p>
-    <w:p>
-      <w:pPr>
-        <w:rPr>
-          <w:lang w:eastAsia="zh-TW"/>
-        </w:rPr>
-      </w:pPr>
-      <w:r>
-        <w:rPr>
-          <w:lang w:eastAsia="zh-CN"/>
-        </w:rPr>
-        <w:t xml:space="preserve">　</w:t>
-      </w:r>
-      <w:r>
-        <w:rPr>
-          <w:lang w:eastAsia="zh-TW"/>
-        </w:rPr>
-        <w:t>会　　　場：大阪市立東洋陶磁美術館（〒</w:t>
-      </w:r>
-      <w:r>
-        <w:rPr>
-          <w:lang w:eastAsia="zh-TW"/>
-        </w:rPr>
-        <w:t>530-0005</w:t>
-      </w:r>
-      <w:r>
-        <w:rPr>
-          <w:lang w:eastAsia="zh-TW"/>
-        </w:rPr>
-        <w:t xml:space="preserve">　大阪市北区中之島</w:t>
-      </w:r>
-      <w:r>
-        <w:rPr>
-          <w:lang w:eastAsia="zh-TW"/>
-        </w:rPr>
-        <w:t>1-1-26</w:t>
-      </w:r>
-      <w:r>
-        <w:rPr>
-          <w:lang w:eastAsia="zh-TW"/>
-        </w:rPr>
-        <w:t>）</w:t>
-      </w:r>
-    </w:p>
-    <w:p>
-      <w:r>
-        <w:rPr>
-          <w:lang w:eastAsia="zh-TW"/>
-        </w:rPr>
-        <w:t xml:space="preserve">　</w:t>
-      </w:r>
-      <w:r>
-        <w:t>開</w:t>
-      </w:r>
-      <w:r>
-        <w:t xml:space="preserve"> </w:t>
-      </w:r>
-      <w:r>
-        <w:t>館</w:t>
-      </w:r>
-      <w:r>
-        <w:t xml:space="preserve"> </w:t>
-      </w:r>
-      <w:r>
-        <w:t>時</w:t>
-      </w:r>
-      <w:r>
-        <w:t xml:space="preserve"> </w:t>
-      </w:r>
-      <w:r>
-        <w:t>間：午前</w:t>
-      </w:r>
-      <w:r>
-        <w:t>9</w:t>
-      </w:r>
-      <w:r>
-        <w:t>時</w:t>
-      </w:r>
-      <w:r>
-        <w:t>30</w:t>
-      </w:r>
-      <w:r>
-        <w:t>分〜午後</w:t>
-      </w:r>
-      <w:r>
-        <w:t>5</w:t>
-      </w:r>
-      <w:r>
-        <w:t>時（入館は午後</w:t>
-      </w:r>
-      <w:r>
-        <w:t>4</w:t>
-      </w:r>
-      <w:r>
-        <w:t>時</w:t>
-      </w:r>
-      <w:r>
-        <w:t>30</w:t>
-      </w:r>
-      <w:r>
-        <w:t>分まで）</w:t>
-      </w:r>
-    </w:p>
-    <w:p>
-      <w:pPr>
-        <w:rPr>
-          <w:lang w:eastAsia="zh-TW"/>
-        </w:rPr>
-      </w:pPr>
-      <w:r>
-        <w:t xml:space="preserve">　</w:t>
-      </w:r>
-      <w:r>
-        <w:rPr>
-          <w:lang w:eastAsia="zh-TW"/>
-        </w:rPr>
-        <w:t>主　　　催：大阪市立東洋陶磁美術館</w:t>
-      </w:r>
-    </w:p>
-    <w:p>
-      <w:r>
-        <w:rPr>
-          <w:lang w:eastAsia="zh-TW"/>
-        </w:rPr>
-        <w:t xml:space="preserve">　</w:t>
-      </w:r>
-      <w:r>
-        <w:t>共　　　催：</w:t>
-      </w:r>
-      <w:r>
-        <w:t>NHK</w:t>
-      </w:r>
-      <w:r>
-        <w:t>エンタープライズ近畿</w:t>
-      </w:r>
-    </w:p>
-    <w:p>
-      <w:pPr>
-        <w:rPr>
-          <w:lang w:eastAsia="zh-TW"/>
-        </w:rPr>
-      </w:pPr>
-      <w:r>
-        <w:t xml:space="preserve">　</w:t>
-      </w:r>
-      <w:r>
-        <w:rPr>
-          <w:lang w:eastAsia="zh-TW"/>
-        </w:rPr>
-        <w:t>特</w:t>
-      </w:r>
-      <w:r>
-        <w:rPr>
-          <w:lang w:eastAsia="zh-TW"/>
-        </w:rPr>
-        <w:t xml:space="preserve"> </w:t>
-      </w:r>
-      <w:r>
-        <w:rPr>
-          <w:lang w:eastAsia="zh-TW"/>
-        </w:rPr>
-        <w:t>別</w:t>
-      </w:r>
-      <w:r>
-        <w:rPr>
-          <w:lang w:eastAsia="zh-TW"/>
-        </w:rPr>
-        <w:t xml:space="preserve"> </w:t>
-      </w:r>
-      <w:r>
-        <w:rPr>
-          <w:lang w:eastAsia="zh-TW"/>
-        </w:rPr>
-        <w:t>協</w:t>
-      </w:r>
-      <w:r>
-        <w:rPr>
-          <w:lang w:eastAsia="zh-TW"/>
-        </w:rPr>
-        <w:t xml:space="preserve"> </w:t>
-      </w:r>
-      <w:r>
-        <w:rPr>
-          <w:lang w:eastAsia="zh-TW"/>
-        </w:rPr>
-        <w:t>賛：大同生命保険株式会社</w:t>
-      </w:r>
-    </w:p>
-    <w:p>
-      <w:pPr>
-        <w:rPr>
-          <w:lang w:eastAsia="zh-TW"/>
-        </w:rPr>
-      </w:pPr>
-    </w:p>
-    <w:p>
-      <w:r>
-        <w:rPr>
-          <w:b/>
-        </w:rPr>
-        <w:t>２．拝借希望作品</w:t>
-      </w:r>
-    </w:p>
-    <w:p>
-      <w:r>
-        <w:t xml:space="preserve">　紅葉呉器茶碗　　朝鮮時代・</w:t>
-      </w:r>
-      <w:r>
-        <w:t>16</w:t>
-      </w:r>
-      <w:r>
-        <w:t>世紀　　大名物　　１口</w:t>
-      </w:r>
-    </w:p>
-    <w:p/>
-    <w:p>
-      <w:pPr>
-        <w:rPr>
-          <w:lang w:eastAsia="zh-TW"/>
-        </w:rPr>
-      </w:pPr>
-      <w:r>
-        <w:rPr>
-          <w:b/>
-          <w:lang w:eastAsia="zh-TW"/>
-        </w:rPr>
-        <w:lastRenderedPageBreak/>
-        <w:t>３．拝借希望期間</w:t>
-      </w:r>
-    </w:p>
-    <w:p>
-      <w:pPr>
-        <w:rPr>
-          <w:lang w:eastAsia="zh-TW"/>
-        </w:rPr>
-      </w:pPr>
-      <w:r>
-        <w:rPr>
-          <w:lang w:eastAsia="zh-TW"/>
-        </w:rPr>
-        <w:t xml:space="preserve">　</w:t>
-      </w:r>
-      <w:r>
-        <w:rPr>
-          <w:lang w:eastAsia="zh-TW"/>
-        </w:rPr>
-        <w:t>2027</w:t>
-      </w:r>
-      <w:r>
-        <w:rPr>
-          <w:lang w:eastAsia="zh-TW"/>
-        </w:rPr>
-        <w:t>年３月下旬〜</w:t>
-      </w:r>
-      <w:r>
-        <w:rPr>
-          <w:lang w:eastAsia="zh-TW"/>
-        </w:rPr>
-        <w:t>10</w:t>
-      </w:r>
-      <w:r>
-        <w:rPr>
-          <w:lang w:eastAsia="zh-TW"/>
-        </w:rPr>
-        <w:t>月上旬（予定）</w:t>
-      </w:r>
-    </w:p>
-    <w:p>
-      <w:r>
-        <w:rPr>
-          <w:lang w:eastAsia="zh-TW"/>
-        </w:rPr>
-        <w:t xml:space="preserve">　</w:t>
-      </w:r>
-      <w:r>
-        <w:t>※</w:t>
-      </w:r>
-      <w:r>
-        <w:t>借用・返却の具体的な日程につきましては、改めてご相談申し上げます。</w:t>
-      </w:r>
-    </w:p>
-    <w:p/>
-    <w:p>
-      <w:r>
-        <w:rPr>
-          <w:b/>
-        </w:rPr>
-        <w:t>４．作品の保全</w:t>
-      </w:r>
-    </w:p>
-    <w:p>
-      <w:r>
-        <w:t xml:space="preserve">　ご出品賜りました作品については、拝借から返却までの全期間に保険をお掛けします。また、作品の輸送・展示・保管において、主催者が一切の責任を負うものとし、作品の取り扱いは学芸員と、その指導のもとに美術品輸送専門業者が行います。</w:t>
-      </w:r>
-    </w:p>
-    <w:p/>
-    <w:p>
-      <w:r>
-        <w:rPr>
-          <w:b/>
-        </w:rPr>
-        <w:t>５．写真撮影・広報用資料掲載</w:t>
-      </w:r>
-    </w:p>
-    <w:p>
-      <w:r>
-        <w:t xml:space="preserve">　展覧会図録制作、会場内画像パネル・映像制作、展覧会の広報目的に限っての印刷物等（ポスター、チラシ、入場券、招待券、看板等）制作、新聞・雑誌等の情報掲載、教育普及、事業報告、インターネット等における写真の利用（</w:t>
-      </w:r>
-      <w:r>
-        <w:t>SNS</w:t>
-      </w:r>
-      <w:r>
-        <w:t>含む）、資料用および展示映像制作のための写真・映像撮影、テレビ・雑誌・新聞等各種媒体による映像および写真撮影・放映（作品の一点撮り含む）についても、あわせてご了承くださいますようお願い申し上げます。</w:t>
-      </w:r>
-    </w:p>
-    <w:p/>
-    <w:p>
-      <w:r>
-        <w:rPr>
-          <w:b/>
-        </w:rPr>
-        <w:t>〈担当・連絡先〉</w:t>
-      </w:r>
-    </w:p>
-    <w:p>
-      <w:r>
-        <w:t xml:space="preserve">　大阪市立東洋陶磁美術館　学芸課（担当：小林　仁）</w:t>
-      </w:r>
-    </w:p>
-    <w:p>
-      <w:r>
-        <w:t xml:space="preserve">　〒</w:t>
-      </w:r>
-      <w:r>
-        <w:t>530-0005</w:t>
-      </w:r>
-      <w:r>
-        <w:t xml:space="preserve">　大阪市北区中之島</w:t>
-      </w:r>
-      <w:r>
-        <w:t>1-1-26</w:t>
-      </w:r>
-    </w:p>
-    <w:p>
-      <w:r>
-        <w:t xml:space="preserve">　電話：</w:t>
-      </w:r>
-      <w:r>
-        <w:t>06-6223-0058</w:t>
-      </w:r>
-      <w:r>
-        <w:t xml:space="preserve">　　</w:t>
-      </w:r>
-      <w:r>
-        <w:t>E-mail</w:t>
-      </w:r>
-      <w:r>
-        <w:t>：</w:t>
-      </w:r>
-      <w:r>
-        <w:t>xiaolin@moco.or.jp</w:t>
-      </w:r>
-    </w:p>
-    <w:p/>
-    <w:p>
-      <w:pPr>
-        <w:jc w:val="right"/>
-      </w:pPr>
-      <w:r>
-        <w:t>以　上</w:t>
-      </w:r>
-    </w:p>
-    <w:p/>
+        <w:rPr>
+          <w:rFonts w:hint="eastAsia"/>
+        </w:rPr>
+      </w:pPr>
+      <w:r>
+        <w:rPr>
+          <w:rFonts w:hint="eastAsia"/>
+        </w:rPr>
+        <w:t>以上</w:t>
+      </w:r>
+    </w:p>
     <w:sectPr>
       <w:headerReference w:type="default" r:id="rId8"/>
       <w:pgSz w:w="11906" w:h="16838" w:code="9"/>
@@ -1479,6 +2099,41 @@
       <w:szCs w:val="22"/>
     </w:rPr>
   </w:style>
+  <w:style w:type="paragraph" w:customStyle="1" w:styleId="isselectedend">
+    <w:name w:val="isselectedend"/>
+    <w:basedOn w:val="a"/>
+    <w:rsid w:val="006254A0"/>
+    <w:pPr>
+      <w:widowControl/>
+      <w:spacing w:before="100" w:beforeAutospacing="1" w:after="100" w:afterAutospacing="1"/>
+      <w:jc w:val="left"/>
+    </w:pPr>
+    <w:rPr>
+      <w:rFonts w:ascii="ＭＳ Ｐゴシック" w:eastAsia="ＭＳ Ｐゴシック" w:hAnsi="ＭＳ Ｐゴシック" w:cs="ＭＳ Ｐゴシック"/>
+      <w:kern w:val="0"/>
+      <w:sz w:val="24"/>
+      <w:szCs w:val="24"/>
+    </w:rPr>
+  </w:style>
+  <w:style w:type="paragraph" w:styleId="Web">
+    <w:name w:val="Normal (Web)"/>
+    <w:basedOn w:val="a"/>
+    <w:uiPriority w:val="99"/>
+    <w:semiHidden/>
+    <w:unhideWhenUsed/>
+    <w:rsid w:val="006254A0"/>
+    <w:pPr>
+      <w:widowControl/>
+      <w:spacing w:before="100" w:beforeAutospacing="1" w:after="100" w:afterAutospacing="1"/>
+      <w:jc w:val="left"/>
+    </w:pPr>
+    <w:rPr>
+      <w:rFonts w:ascii="ＭＳ Ｐゴシック" w:eastAsia="ＭＳ Ｐゴシック" w:hAnsi="ＭＳ Ｐゴシック" w:cs="ＭＳ Ｐゴシック"/>
+      <w:kern w:val="0"/>
+      <w:sz w:val="24"/>
+      <w:szCs w:val="24"/>
+    </w:rPr>
+  </w:style>
 </w:styles>
 </file>
 

</xml_diff>